<commit_message>
updated tags bulbol resume
</commit_message>
<xml_diff>
--- a/app/static/documents/mark-christian-taguiad-resume.docx
+++ b/app/static/documents/mark-christian-taguiad-resume.docx
@@ -149,6 +149,105 @@
           <w:rFonts w:ascii="Spectral" w:cs="Spectral" w:eastAsia="Spectral" w:hAnsi="Spectral"/>
           <w:sz w:val="7"/>
           <w:szCs w:val="7"/>
+        </w:rPr>
+      </w:pPr>
+      <w:r>
+        <w:rPr>
+          <w:rtl w:val="0"/>
+        </w:rPr>
+      </w:r>
+    </w:p>
+    <w:p>
+      <w:pPr>
+        <w:tabs>
+          <w:tab w:val="left" w:leader="none" w:pos="1134"/>
+          <w:tab w:val="right" w:leader="none" w:pos="10503"/>
+        </w:tabs>
+        <w:rPr>
+          <w:rFonts w:ascii="Spectral" w:cs="Spectral" w:eastAsia="Spectral" w:hAnsi="Spectral"/>
+          <w:sz w:val="21"/>
+          <w:szCs w:val="21"/>
+        </w:rPr>
+      </w:pPr>
+      <w:r>
+        <w:rPr>
+          <w:rFonts w:ascii="Spectral" w:cs="Spectral" w:eastAsia="Spectral" w:hAnsi="Spectral"/>
+          <w:b w:val="1"/>
+          <w:bCs w:val="1"/>
+          <w:sz w:val="21"/>
+          <w:szCs w:val="21"/>
+          <w:rtl w:val="0"/>
+        </w:rPr>
+        <w:t xml:space="preserve">Arellano University School of Law | </w:t>
+      </w:r>
+      <w:r>
+        <w:rPr>
+          <w:rFonts w:ascii="Spectral" w:cs="Spectral" w:eastAsia="Spectral" w:hAnsi="Spectral"/>
+          <w:sz w:val="21"/>
+          <w:szCs w:val="21"/>
+          <w:rtl w:val="0"/>
+        </w:rPr>
+        <w:t xml:space="preserve">Taft Ave, Pasay         </w:t>
+      </w:r>
+      <w:r>
+        <w:rPr>
+          <w:rFonts w:ascii="Spectral" w:cs="Spectral" w:eastAsia="Spectral" w:hAnsi="Spectral"/>
+          <w:b w:val="1"/>
+          <w:bCs w:val="1"/>
+          <w:sz w:val="21"/>
+          <w:szCs w:val="21"/>
+          <w:rtl w:val="0"/>
+        </w:rPr>
+        <w:t xml:space="preserve">                                                                           </w:t>
+      </w:r>
+      <w:r>
+        <w:rPr>
+          <w:rFonts w:ascii="Spectral" w:cs="Spectral" w:eastAsia="Spectral" w:hAnsi="Spectral"/>
+          <w:sz w:val="21"/>
+          <w:szCs w:val="21"/>
+          <w:rtl w:val="0"/>
+        </w:rPr>
+        <w:t xml:space="preserve">Currently Enrolled</w:t>
+      </w:r>
+    </w:p>
+    <w:p>
+      <w:pPr>
+        <w:tabs>
+          <w:tab w:val="left" w:leader="none" w:pos="1134"/>
+          <w:tab w:val="right" w:leader="none" w:pos="11064"/>
+        </w:tabs>
+        <w:rPr>
+          <w:rFonts w:ascii="Spectral" w:cs="Spectral" w:eastAsia="Spectral" w:hAnsi="Spectral"/>
+          <w:b w:val="1"/>
+          <w:bCs w:val="1"/>
+          <w:sz w:val="21"/>
+          <w:szCs w:val="21"/>
+        </w:rPr>
+      </w:pPr>
+      <w:r>
+        <w:rPr>
+          <w:rFonts w:ascii="Spectral" w:cs="Spectral" w:eastAsia="Spectral" w:hAnsi="Spectral"/>
+          <w:b w:val="1"/>
+          <w:bCs w:val="1"/>
+          <w:sz w:val="21"/>
+          <w:szCs w:val="21"/>
+          <w:rtl w:val="0"/>
+        </w:rPr>
+        <w:t xml:space="preserve">Juris Doctor</w:t>
+      </w:r>
+    </w:p>
+    <w:p>
+      <w:pPr>
+        <w:tabs>
+          <w:tab w:val="left" w:leader="none" w:pos="1134"/>
+          <w:tab w:val="right" w:leader="none" w:pos="11064"/>
+        </w:tabs>
+        <w:rPr>
+          <w:rFonts w:ascii="Spectral" w:cs="Spectral" w:eastAsia="Spectral" w:hAnsi="Spectral"/>
+          <w:b w:val="1"/>
+          <w:bCs w:val="1"/>
+          <w:sz w:val="21"/>
+          <w:szCs w:val="21"/>
         </w:rPr>
       </w:pPr>
       <w:r>

</xml_diff>